<commit_message>
Apply red-team fixes across the package
Fix unverified surgery-site and clinic claims, competitor overstatement,
add cost per contact, state an exclusivity position, align the rubric,
bidding ladder, gates, and CPC ranges across files, set document
metadata, and tighten the note to Kristina. Adds the QA report.

Co-Authored-By: Claude Fable 5.1 <noreply@anthropic.com>
Claude-Session: https://claude.ai/code/session_01GD6g2VXLwfea8fyRm3LH8N
</commit_message>
<xml_diff>
--- a/hartigan-ppc/06_proposal.docx
+++ b/hartigan-ppc/06_proposal.docx
@@ -48,7 +48,7 @@
         <w:rPr>
           <w:sz w:val="20"/>
         </w:rPr>
-        <w:t>, office of Dr. David Hartigan, MD</w:t>
+        <w:t>, office of David Hartigan, MD</w:t>
       </w:r>
     </w:p>
     <w:p>
@@ -237,7 +237,7 @@
               <w:pStyle w:val="TableText"/>
             </w:pPr>
             <w:r>
-              <w:t>Three search campaigns at launch (hip replacement, knee replacement, small hip preservation); sports medicine (ACL, meniscus, rotator cuff) phases in at day 60 or the next tier. Twin Cities metro, weighted to Plymouth, Maple Grove, and Edina.</w:t>
+              <w:t>Three search campaigns at launch (hip replacement, knee replacement, small hip preservation); sports medicine (ACL, meniscus, rotator cuff) phases in at day 60 or the next tier. Twin Cities metro (a 30-mile radius on Robbinsdale), weighted to Plymouth, Maple Grove, and Edina.</w:t>
             </w:r>
           </w:p>
         </w:tc>
@@ -824,7 +824,7 @@
         <w:t>Geography.</w:t>
       </w:r>
       <w:r>
-        <w:t xml:space="preserve"> Plymouth, Maple Grove, and Edina first, then the broader Twin Cities. Our research shows Dr. Hartigan seeing patients at Twin Cities Orthopedics clinics in Edina, Maple Grove, Robbinsdale, and Plymouth, with outpatient surgery at Crosstown Surgery Center in Edina and North Memorial Ambulatory Surgery Center in Maple Grove. Maple Grove and Robbinsdale cover the northwest suburbs, Edina the southwest, and Plymouth sits within 15 minutes of both. Hip preservation is where his fellowship training stands out most, so that campaign also reaches a ring of about 60 miles from Maple Grove (the St. Cloud corridor and western Wisconsin), leaving out Rochester (Mayo's home market), Eau Claire, and Duluth.</w:t>
+        <w:t xml:space="preserve"> Plymouth, Maple Grove, and Edina first, then the broader Twin Cities. Our research shows Dr. Hartigan at Twin Cities Orthopedics clinics in Edina, Maple Grove, and Robbinsdale, with a Plymouth address on his personal site, and outpatient surgery at North Memorial Ambulatory Surgery Center in Maple Grove, which lists him, and, we understand, at Crosstown Surgery Center in Edina; we confirm clinic days by site and surgery sites at kickoff. Maple Grove and Robbinsdale cover the northwest suburbs, Edina the southwest, and Plymouth sits within 15 minutes of both. Hip preservation is where his fellowship training stands out most, so that campaign also reaches a ring of about 60 miles from Maple Grove (the St. Cloud corridor and western Wisconsin), leaving out Rochester (Mayo's home market), Eau Claire, and Duluth.</w:t>
       </w:r>
     </w:p>
     <w:p>
@@ -835,7 +835,7 @@
         <w:t>The market.</w:t>
       </w:r>
       <w:r>
-        <w:t xml:space="preserve"> Allina Health Orthopedics (Plymouth and Edina), TRIA, Summit, M Health Fairview, and Mayo Clinic offer the same procedures nearby, and TCO's own hip and knee pages name other surgeons, so the ads lead with what is verifiable and his: board certification, Mayo Clinic residency, and dual fellowship training.</w:t>
+        <w:t xml:space="preserve"> Allina Health Orthopedics (Plymouth and Edina), TRIA, Summit, M Health Fairview, and Mayo Clinic each offer hip or knee replacement nearby, Allina, TRIA, Summit, and Mayo also advertise hip arthroscopy or hip preservation, and TCO's own hip and knee pages name other surgeons, so the ads lead with what is verifiable and his: board certification, Mayo Clinic residency, and dual fellowship training.</w:t>
       </w:r>
     </w:p>
     <w:p>
@@ -859,7 +859,7 @@
     </w:p>
     <w:p>
       <w:r>
-        <w:t>Launch three search campaigns: hip replacement, knee replacement, and a small hip preservation campaign. ACL, meniscus, and rotator cuff run as one sports medicine campaign with three ad groups, added at day 60 if the launch campaigns are demand-bound and cost per qualified inquiry is at or below our base estimate, or sooner at the Growth tier. Why: hip and knee replacement carry the demand (an estimated 800 to 3,300 surgeon-seeking and procedure searches a month each in the metro, against 250 to 1,100 per sports procedure and 120 to 590 for hip preservation), hip arthroscopy and anterior outpatient hip replacement are his verified emphasis, and at $3,000 a month, three campaigns each yield a readable search-term report by day 30; six would not.</w:t>
+        <w:t>Launch three search campaigns: hip replacement, knee replacement, and a small hip preservation campaign. ACL, meniscus, and rotator cuff run as one sports medicine campaign with four ad groups, added at day 60 if the launch campaigns are demand-bound and cost per qualified inquiry is at or below our base estimate, or sooner at the Growth tier. Why: hip and knee replacement carry the demand (an estimated 800 to 2,500 surgeon-seeking and procedure searches a month for hip and 1,000 to 3,300 for knee in the metro, against 250 to 1,100 per sports procedure and 120 to 590 for hip preservation), hip arthroscopy and anterior outpatient hip replacement are his verified emphasis, and at $3,000 a month, three campaigns each yield a readable search-term report by day 30; six would not.</w:t>
       </w:r>
     </w:p>
     <w:tbl>
@@ -1176,7 +1176,7 @@
     </w:p>
     <w:p>
       <w:r>
-        <w:t>We recommend $3,000 a month in media (range $2,000 to $4,000), the Pilot tier, plus the management fee in section 11. It sits above the base-case demand ceiling for the three launch campaigns (about $2,050 a month), so demand, not budget, is the first constraint; in the high case it deploys fully at about 27 contacts a month, near Google's 30-conversion threshold for Target CPA. The practice pays Google directly, and Google bills only what serves: 90-day exposure is at most $9,000, with about $1,000 to $9,000 expected to deploy.</w:t>
+        <w:t>We recommend $3,000 a month in media (range $2,000 to $4,000), the Pilot tier, plus the management fee in section 11. It sits above the base-case spend the model can deploy for the three launch campaigns (about $2,050 a month), so demand, not budget, is the first constraint; in the high case it deploys fully at about 27 contacts a month, near Google's 30-conversion threshold for Target CPA. The practice pays Google directly, and Google bills only what serves: 90-day exposure is at most $9,000, with about $1,000 to $9,000 expected to deploy.</w:t>
       </w:r>
     </w:p>
     <w:tbl>
@@ -1649,7 +1649,7 @@
               <w:rPr>
                 <w:b/>
               </w:rPr>
-              <w:t>Expected monthly results (low / base / high)</w:t>
+              <w:t>Modeled monthly results (low / base / high)</w:t>
             </w:r>
           </w:p>
         </w:tc>
@@ -1888,7 +1888,7 @@
         <w:pStyle w:val="Heading1"/>
       </w:pPr>
       <w:r>
-        <w:t>6. Expected cost per click, per inquiry, and per consult</w:t>
+        <w:t>6. Expected cost per click, per contact, per inquiry, and per consult</w:t>
       </w:r>
     </w:p>
     <w:tbl>
@@ -2015,7 +2015,7 @@
               <w:pStyle w:val="TableText"/>
             </w:pPr>
             <w:r>
-              <w:t>Cost per qualified inquiry</w:t>
+              <w:t>Cost per contact (a call of 60 seconds or more, or a form)</w:t>
             </w:r>
           </w:p>
         </w:tc>
@@ -2028,7 +2028,7 @@
               <w:pStyle w:val="TableText"/>
             </w:pPr>
             <w:r>
-              <w:t>$180 to $390</w:t>
+              <w:t>$100 to $125</w:t>
             </w:r>
           </w:p>
         </w:tc>
@@ -2041,7 +2041,7 @@
               <w:pStyle w:val="TableText"/>
             </w:pPr>
             <w:r>
-              <w:t>6% to 14% of clicks become a 60-second call or a form; 30% to 60% of those contacts qualify</w:t>
+              <w:t>Deployed spend divided by contacts, across every tier and case; the national physicians and surgeons cost per lead is $40 to $66 (WordStream 2026, LocalIQ 2025), and ours runs higher because surgical terms cost more per click and only 60-second calls and forms count</w:t>
             </w:r>
           </w:p>
         </w:tc>
@@ -2056,6 +2056,47 @@
               <w:pStyle w:val="TableText"/>
             </w:pPr>
             <w:r>
+              <w:t>Cost per qualified inquiry</w:t>
+            </w:r>
+          </w:p>
+        </w:tc>
+        <w:tc>
+          <w:tcPr>
+            <w:tcW w:type="dxa" w:w="1584"/>
+          </w:tcPr>
+          <w:p>
+            <w:pPr>
+              <w:pStyle w:val="TableText"/>
+            </w:pPr>
+            <w:r>
+              <w:t>$180 to $390</w:t>
+            </w:r>
+          </w:p>
+        </w:tc>
+        <w:tc>
+          <w:tcPr>
+            <w:tcW w:type="dxa" w:w="5472"/>
+          </w:tcPr>
+          <w:p>
+            <w:pPr>
+              <w:pStyle w:val="TableText"/>
+            </w:pPr>
+            <w:r>
+              <w:t>6% to 14% of clicks become a 60-second call or a form; 30% to 60% of those contacts qualify</w:t>
+            </w:r>
+          </w:p>
+        </w:tc>
+      </w:tr>
+      <w:tr>
+        <w:tc>
+          <w:tcPr>
+            <w:tcW w:type="dxa" w:w="2304"/>
+          </w:tcPr>
+          <w:p>
+            <w:pPr>
+              <w:pStyle w:val="TableText"/>
+            </w:pPr>
+            <w:r>
               <w:t>Cost per attended consult</w:t>
             </w:r>
           </w:p>
@@ -2069,7 +2110,7 @@
               <w:pStyle w:val="TableText"/>
             </w:pPr>
             <w:r>
-              <w:t>$250 to $1,000</w:t>
+              <w:t>$250 to $1,050</w:t>
             </w:r>
           </w:p>
         </w:tc>
@@ -2082,7 +2123,7 @@
               <w:pStyle w:val="TableText"/>
             </w:pPr>
             <w:r>
-              <w:t>About 65% of qualified inquiries book and 85% attend; before management fees</w:t>
+              <w:t>50% to 80% of qualified inquiries book and 75% to 92% attend; before management fees</w:t>
             </w:r>
           </w:p>
         </w:tc>
@@ -2113,7 +2154,7 @@
     </w:p>
     <w:p>
       <w:r>
-        <w:t>No existing page is a finished ad destination, which is common: pages built for visitors and pages built for ads do different jobs. The TCO group pages carry the booking path and the brand but name other surgeons and give us no control over tracking. The personal site, davidhartiganmd.com, carries his credentials and phone on every page, but the procedure pages are template copy, hip replacement is split across three pages, and there is no knee replacement page.</w:t>
+        <w:t>No existing page is a finished ad destination, which is common: pages built for visitors and pages built for ads do different jobs. The TCO group pages carry the booking path and the brand but name other surgeons and give us no control over tracking. The personal site, davidhartiganmd.com, carries his credentials and phone on the pages we reviewed, but the procedure pages are template copy, hip replacement is split across three pages, and there is no knee replacement page.</w:t>
       </w:r>
     </w:p>
     <w:p>
@@ -2310,7 +2351,7 @@
         <w:t>Qualified-inquiry rubric,</w:t>
       </w:r>
       <w:r>
-        <w:t xml:space="preserve"> applied by intake in under a minute: new to Dr. Hartigan; can be seen in Edina, Maple Grove, or Plymouth, or wants a hip preservation opinion; asking about one of the six procedures; insurance accepted or a self-pay or MDsave path; a real patient, not a vendor, recruiter, or misdial. Five yes answers means qualified; otherwise intake records only a reason code plus whether a consult was booked. A monthly 20-minute de-identified review with the intake lead covers counts by code, campaign, day, and hour. The practice's compliance team and counsel review this setup before launch; nothing here is legal advice.</w:t>
+        <w:t xml:space="preserve"> applied by intake in under a minute: new to Dr. Hartigan; can be seen at Edina, Maple Grove, Plymouth, or Robbinsdale, or wants a hip preservation opinion; asking about one of the six procedures; insurance accepted or a self-pay or MDsave path; a real patient, not a vendor, recruiter, or misdial. Five yes answers means qualified; otherwise intake records only a reason code plus whether a consult was booked. A monthly 20-minute de-identified review with the intake lead covers counts by code, campaign, day, and hour. The practice's compliance team and counsel review this setup before launch; nothing here is legal advice. Counsel also confirms the practice's notices under Minnesota's Consumer Data Privacy Act and Health Records Act and decides on restricted data processing in the tag setup; our defaults do not change either way.</w:t>
       </w:r>
     </w:p>
     <w:p>
@@ -2437,7 +2478,7 @@
               <w:pStyle w:val="TableText"/>
             </w:pPr>
             <w:r>
-              <w:t>Kickoff; Google Ads access or account creation; qualified-inquiry definition, intake hours, and the three confirmations in section 16; call and form vendors chosen and BAAs sent; TCO approval requested if required.</w:t>
+              <w:t>Kickoff; Google Ads access or account creation; qualified-inquiry definition, intake hours, and the four confirmations in section 16; call and form vendors chosen and BAAs sent; TCO approval requested if required.</w:t>
             </w:r>
           </w:p>
         </w:tc>
@@ -2648,7 +2689,7 @@
               <w:pStyle w:val="TableText"/>
             </w:pPr>
             <w:r>
-              <w:t>Search-term and lead-quality review; contacts against the 3 to 27 range; if fewer than about 30% of contacts qualify, we tighten terms first; if more than 20% of impressions are lost to budget, the cap rises in $500 steps at day 60.</w:t>
+              <w:t>Search-term and lead-quality review; contacts against the 3 to 27 range; if fewer than about 30% of contacts qualify, we tighten terms first; if more than 10% of impressions are lost to budget, the cap rises in $500 steps between day 60 and day 90.</w:t>
             </w:r>
           </w:p>
         </w:tc>
@@ -2939,7 +2980,16 @@
     </w:p>
     <w:p>
       <w:r>
-        <w:t>We are open to exclusivity and suggest defining it on four points at our call. It is a starting point for conversation, not contract language.</w:t>
+        <w:t xml:space="preserve">We are open to exclusivity and suggest defining it on four points at our call. </w:t>
+      </w:r>
+      <w:r>
+        <w:rPr>
+          <w:highlight w:val="yellow"/>
+        </w:rPr>
+        <w:t>[Suggested position, KRISTINA TO CONFIRM OR EDIT: exclusivity for the six procedures in this proposal, across the Twin Cities metro, for the engagement term plus a 90-day tail, conditioned on a minimum term and a minimum monthly media budget; broader exclusivity, across all orthopedic and sports medicine surgical services or statewide, is available at a different fee level.]</w:t>
+      </w:r>
+      <w:r>
+        <w:t xml:space="preserve"> The four points below are a starting point for conversation, not contract language.</w:t>
       </w:r>
     </w:p>
     <w:p>
@@ -3067,7 +3117,7 @@
     </w:p>
     <w:p>
       <w:r>
-        <w:t>To start, we need Google Ads admin access (or we create the account in the practice's name and card), a contact at the website vendor for davidhartiganmd.com, the TCO marketing contact if group approval is required, the intake lead (definition and phone hours), the privacy officer (BAAs), and three confirmations: knee replacement volume and setting, the navigation and robotic systems and facilities Dr. Hartigan uses, and whether the practice offers second opinions.</w:t>
+        <w:t>To start, we need Google Ads admin access (or we create the account in the practice's name and card), a contact at the website vendor for davidhartiganmd.com, the TCO marketing contact if group approval is required for the campaign, the pages, or use of the TCO name in ads, the intake lead (definition and phone hours), the privacy officer (BAAs), and four confirmations: knee replacement volume and setting, the navigation and robotic systems and facilities Dr. Hartigan uses, his clinic days by site and his surgery sites, and whether the practice offers second opinions.</w:t>
       </w:r>
     </w:p>
     <w:p>
@@ -5619,7 +5669,7 @@
     </w:p>
     <w:p>
       <w:r>
-        <w:t>Monthly results by tier, low / base / high, from the budget model. Clicks are the lower of budget divided by CPC and the demand cap (searches x query expansion x impression share x click-through rate); deployed spend is clicks times CPC. The cap binds in the low and base cases at every tier, never in the high case, which is why base deployed spend sits below the cap.</w:t>
+        <w:t>Monthly results by tier, low / base / high, from the budget model. Clicks are the lower of budget divided by CPC and the demand cap (searches x query expansion x impression share x click-through rate); deployed spend is clicks times CPC. The cap binds in the low and base cases at every tier, never in the high case, which is why base deployed spend sits below the cap. In the high case the cost per click is also high ($16 rather than $10 for hip replacement), so the same budget buys fewer clicks than at base even though more demand exists.</w:t>
       </w:r>
     </w:p>
     <w:tbl>
@@ -6158,7 +6208,7 @@
     </w:p>
     <w:p>
       <w:r>
-        <w:t>Arithmetic example, Pilot base case, hip replacement: 1,400 searches x 1.25 query expansion = 1,750 eligible searches; cap 1,750 x 60% impression share x 8% click-through rate = 84 clicks, below the 135 the $1,350 budget could buy at $10 a click, so the cap binds; 84 x $10 = $840 deployed; contacts 8.4 (10% of clicks); qualified 3.8 (45%); booked 2.5 (65%); attended 2.1 (85%); $840 / 3.8 = $222 per qualified inquiry; $840 / 2.1 = $402 per consult. Blended CPC across the account runs $6.88 to $17.46.</w:t>
+        <w:t>Arithmetic example, Pilot base case, hip replacement: 1,400 searches x 1.25 query expansion = 1,750 eligible searches; cap 1,750 x 60% impression share x 8% click-through rate = 84 clicks, below the 135 the $1,350 budget could buy at $10 a click, so the cap binds; 84 x $10 = $840 deployed; contacts 8.4 (10% of clicks); qualified 3.78 (45%); booked 2.46 (65%); attended 2.09 (85%); $840 / 3.78 = $222 per qualified inquiry; $840 / 2.09 = $402 per consult. Blended CPC across the account runs $6.57 to $17.46.</w:t>
       </w:r>
     </w:p>
     <w:p>

</xml_diff>

<commit_message>
Trim proposal prose to keep the main body at six pages
Shorter hosting, tracking, reporting, and next-steps wording; tighter
paragraph spacing; clinic count no longer asserted.

Co-Authored-By: Claude Fable 5.1 <noreply@anthropic.com>
Claude-Session: https://claude.ai/code/session_01GD6g2VXLwfea8fyRm3LH8N
</commit_message>
<xml_diff>
--- a/hartigan-ppc/06_proposal.docx
+++ b/hartigan-ppc/06_proposal.docx
@@ -120,7 +120,7 @@
     </w:p>
     <w:p>
       <w:r>
-        <w:t>Thank you for meeting with us and for the clear request that followed. You asked for a Google Ads strategy, monthly spend, fees, expected costs per click and per lead, landing pages, conversion tracking, reporting, contract terms, a conflict disclosure, and a discussion of market exclusivity. This proposal answers each item in the order you listed it, with every figure given as a range and its basis in one line. It is built around the standard you set: we measure qualified patient inquiries and surgical consultations, not clicks or traffic.</w:t>
+        <w:t>Thank you for meeting with us and for the clear request that followed. You asked for a strategy, monthly spend, fees, expected costs per click and per lead, landing pages, tracking, reporting, contract terms, a conflict disclosure, and a view on market exclusivity. This proposal answers each item in the order you listed it, with every figure given as a range and its basis in one line. It is built around the standard you set: we measure qualified patient inquiries and surgical consultations, not clicks or traffic.</w:t>
       </w:r>
     </w:p>
     <w:p>
@@ -824,7 +824,7 @@
         <w:t>Geography.</w:t>
       </w:r>
       <w:r>
-        <w:t xml:space="preserve"> Plymouth, Maple Grove, and Edina first, then the broader Twin Cities. Our research shows Dr. Hartigan at Twin Cities Orthopedics clinics in Edina, Maple Grove, and Robbinsdale, with a Plymouth address on his personal site, and outpatient surgery at North Memorial Ambulatory Surgery Center in Maple Grove, which lists him, and, we understand, at Crosstown Surgery Center in Edina; we confirm clinic days by site and surgery sites at kickoff. Maple Grove and Robbinsdale cover the northwest suburbs, Edina the southwest, and Plymouth sits within 15 minutes of both. Hip preservation is where his fellowship training stands out most, so that campaign also reaches a ring of about 60 miles from Maple Grove (the St. Cloud corridor and western Wisconsin), leaving out Rochester (Mayo's home market), Eau Claire, and Duluth.</w:t>
+        <w:t xml:space="preserve"> Plymouth, Maple Grove, and Edina first, then the broader Twin Cities. Our research shows Dr. Hartigan at Twin Cities Orthopedics clinics in Edina, Maple Grove, and Robbinsdale, with a Plymouth address on his personal site, and outpatient surgery at North Memorial Ambulatory Surgery Center in Maple Grove, which lists him, and, we understand, at Crosstown Surgery Center in Edina; we confirm clinic days by site and surgery sites at kickoff. Maple Grove and Robbinsdale cover the northwest suburbs, Edina the southwest, and Plymouth sits within 15 minutes of both. Hip preservation is where his fellowship training stands out most, so that campaign also reaches a ring of about 60 miles from Maple Grove, leaving out Rochester (Mayo's home market), Eau Claire, and Duluth.</w:t>
       </w:r>
     </w:p>
     <w:p>
@@ -1149,7 +1149,7 @@
         <w:t>Negatives and audiences:</w:t>
       </w:r>
       <w:r>
-        <w:t xml:space="preserve"> about 70 starter negatives (jobs, residency, veterinary, lawsuits, exercises, recovery, medical tourism) plus competitor and hospital names; no health-based audiences, remarketing, or customer lists.</w:t>
+        <w:t xml:space="preserve"> about 70 starter negatives (jobs, veterinary, lawsuits, recovery, and similar) plus competitor and hospital names; no health-based audiences, remarketing, or customer lists.</w:t>
       </w:r>
     </w:p>
     <w:p>
@@ -2041,7 +2041,7 @@
               <w:pStyle w:val="TableText"/>
             </w:pPr>
             <w:r>
-              <w:t>Deployed spend divided by contacts, across every tier and case; the national physicians and surgeons cost per lead is $40 to $66 (WordStream 2026, LocalIQ 2025), and ours runs higher because surgical terms cost more per click and only 60-second calls and forms count</w:t>
+              <w:t>Deployed spend divided by contacts; the national physicians and surgeons cost per lead is $40 to $66 (WordStream 2026, LocalIQ 2025), and ours runs higher because surgical clicks cost more and only 60-second calls and forms count</w:t>
             </w:r>
           </w:p>
         </w:tc>
@@ -2154,12 +2154,12 @@
     </w:p>
     <w:p>
       <w:r>
-        <w:t>No existing page is a finished ad destination, which is common: pages built for visitors and pages built for ads do different jobs. The TCO group pages carry the booking path and the brand but name other surgeons and give us no control over tracking. The personal site, davidhartiganmd.com, carries his credentials and phone on the pages we reviewed, but the procedure pages are template copy, hip replacement is split across three pages, and there is no knee replacement page.</w:t>
+        <w:t>No existing page is a finished ad destination, which is common. The TCO group pages carry the booking path and the brand but name other surgeons and give us no control over tracking. The personal site, davidhartiganmd.com, carries his credentials and phone on the pages we reviewed, but the procedure pages are template copy, hip replacement is split across three pages, and there is no knee replacement page.</w:t>
       </w:r>
     </w:p>
     <w:p>
       <w:r>
-        <w:t>We recommend three paid-only pages on davidhartiganmd.com, with a sports medicine page added at the day 60 gate: Anterior Outpatient Hip Replacement; Knee Replacement (no robotic wording until confirmed); and Hip Arthroscopy and Labral Repair, with a block for patients traveling from greater Minnesota and western Wisconsin. Each page carries a headline that echoes the ad, his credentials, who is a candidate and what the consult covers, the four clinics, insurance and a self-pay path, the phone number first, a short BAA-covered form, and a privacy line; no promised recovery timelines or superiority claims, and testimonials only with written authorization.</w:t>
+        <w:t>We recommend three paid-only pages on davidhartiganmd.com, with a sports medicine page added at the day 60 gate: Anterior Outpatient Hip Replacement; Knee Replacement (no robotic wording until confirmed); and Hip Arthroscopy and Labral Repair, with a block for patients traveling from greater Minnesota and western Wisconsin. Each page carries a headline that echoes the ad, his credentials, who is a candidate and what the consult covers, clinic locations, insurance and a self-pay path, the phone number first, a short BAA-covered form, and a privacy line; no promised recovery timelines or superiority claims, and testimonials only with written authorization.</w:t>
       </w:r>
     </w:p>
     <w:p>
@@ -2170,12 +2170,12 @@
         <w:t>Hosting.</w:t>
       </w:r>
       <w:r>
-        <w:t xml:space="preserve"> The personal site already carries his name and credentials, and its vendor advertises integrations, so the tracking snippet and form should be a ticket rather than a rebuild. Two conditions change this: if TCO marketing requires physician campaigns to land on tcomn.com, we ask for a physician-specific page with the tag in TCO's container and accept the slower release cycle; if the site vendor cannot install the snippet and form within two weeks of kickoff, we build a dedicated landing domain and move the pages back later.</w:t>
+        <w:t xml:space="preserve"> The personal site already carries his name and credentials, and its vendor advertises integrations, so the tracking snippet and form should be a ticket rather than a rebuild. If TCO marketing requires physician campaigns to land on tcomn.com, we ask for a physician-specific page with the tag in TCO's container; if the site vendor cannot install the snippet and form within two weeks, we build a dedicated landing domain.</w:t>
       </w:r>
     </w:p>
     <w:p>
       <w:r>
-        <w:t>Sample ads for all three campaigns and a full outline of the hip replacement page are ready for review at our call; sample headlines include "Hip Replacement Surgeon", "Anterior Hip Replacement", and "Hip Preservation Fellowship".</w:t>
+        <w:t>Sample ads for all three campaigns and a full outline of the hip replacement page are ready for review at our call.</w:t>
       </w:r>
     </w:p>
     <w:p>
@@ -2199,7 +2199,7 @@
         <w:t>Calls.</w:t>
       </w:r>
       <w:r>
-        <w:t xml:space="preserve"> A call-tracking vendor that signs a Business Associate Agreement (CallRail Healthcare, CallTrackingMetrics, WhatConverts, and Invoca do) swaps the number on the landing pages for each paid visit, so every call carries the click ID, campaign, and keyword; the ads' call button uses a static campaign number from the same vendor. Google's call reporting and recording stay off: they route calls through Google numbers, and Google signs no BAA for Google Ads.</w:t>
+        <w:t xml:space="preserve"> A call-tracking vendor that signs a Business Associate Agreement (CallRail Healthcare, CallTrackingMetrics, WhatConverts, and Invoca do) swaps the landing page number for each paid visit, so every call carries the click ID, campaign, and keyword; the ads' call button uses a static number from the same vendor. Google's call reporting and recording stay off, because Google signs no BAA for Google Ads.</w:t>
       </w:r>
     </w:p>
     <w:p>
@@ -2351,7 +2351,7 @@
         <w:t>Qualified-inquiry rubric,</w:t>
       </w:r>
       <w:r>
-        <w:t xml:space="preserve"> applied by intake in under a minute: new to Dr. Hartigan; can be seen at Edina, Maple Grove, Plymouth, or Robbinsdale, or wants a hip preservation opinion; asking about one of the six procedures; insurance accepted or a self-pay or MDsave path; a real patient, not a vendor, recruiter, or misdial. Five yes answers means qualified; otherwise intake records only a reason code plus whether a consult was booked. A monthly 20-minute de-identified review with the intake lead covers counts by code, campaign, day, and hour. The practice's compliance team and counsel review this setup before launch; nothing here is legal advice. Counsel also confirms the practice's notices under Minnesota's Consumer Data Privacy Act and Health Records Act and decides on restricted data processing in the tag setup; our defaults do not change either way.</w:t>
+        <w:t xml:space="preserve"> applied by intake in under a minute: new to Dr. Hartigan; can be seen at Edina, Maple Grove, Plymouth, or Robbinsdale, or wants a hip preservation opinion; asking about one of the six procedures; insurance accepted or a self-pay or MDsave path; a real patient, not a vendor, recruiter, or misdial. Five yes answers means qualified; otherwise intake records only a reason code plus whether a consult was booked. A monthly de-identified review with the intake lead covers counts by code, campaign, day, and hour. The practice's compliance team and counsel review this setup before launch; nothing here is legal advice. Counsel also confirms the practice's notices under Minnesota's Consumer Data Privacy Act and Health Records Act and decides on restricted data processing; our defaults do not change either way.</w:t>
       </w:r>
     </w:p>
     <w:p>
@@ -2381,7 +2381,7 @@
         <w:t>We steer by</w:t>
       </w:r>
       <w:r>
-        <w:t xml:space="preserve"> the practice's count of qualified inquiries and consults, the measure you set. Google's conversion count runs higher and is the bidding signal only: it counts repeat calls, callers who also submit a form, and calls outside its window, while intake logs can miss a contact. We reconcile the two monthly inside the call vendor by call ID and timestamp and report the gap.</w:t>
+        <w:t xml:space="preserve"> the practice's count of qualified inquiries and consults, the measure you set. Google's conversion count runs higher (repeat calls, callers who also submit a form, calls outside its window) and is the bidding signal only; we reconcile the two monthly by call ID and timestamp and report the gap.</w:t>
       </w:r>
     </w:p>
     <w:p>
@@ -2745,7 +2745,7 @@
               <w:pStyle w:val="TableText"/>
             </w:pPr>
             <w:r>
-              <w:t>Scale to Growth ($6,000) if two-month cost per qualified inquiry is at or below about $220 and cost per attended consult at or below about $400, with more than 10% lost to budget; hold at $3,000 between about $220 and $380 per qualified inquiry; cut (lower the cap to the strongest campaign's deployed spend, or pause the weakest) above about $380 per qualified inquiry or about $1,000 per consult for two months running.</w:t>
+              <w:t>Scale to Growth ($6,000) if two-month cost per qualified inquiry is at or below about $220 and cost per attended consult at or below about $400, with more than 10% lost to budget; hold at $3,000 between about $220 and $380 per qualified inquiry; cut (lower the cap or pause the weakest campaign) above about $380 per qualified inquiry or about $1,000 per consult for two months running.</w:t>
             </w:r>
           </w:p>
         </w:tc>
@@ -3094,7 +3094,7 @@
     </w:p>
     <w:p>
       <w:r>
-        <w:t xml:space="preserve">A 30-minute call to walk through this proposal, review the sample ads and page outline, and settle the conflict and exclusivity questions: </w:t>
+        <w:t xml:space="preserve">A 30-minute call to walk through this proposal, the sample ads, and the conflict and exclusivity questions: </w:t>
       </w:r>
       <w:r>
         <w:rPr>
@@ -3117,7 +3117,7 @@
     </w:p>
     <w:p>
       <w:r>
-        <w:t>To start, we need Google Ads admin access (or we create the account in the practice's name and card), a contact at the website vendor for davidhartiganmd.com, the TCO marketing contact if group approval is required for the campaign, the pages, or use of the TCO name in ads, the intake lead (definition and phone hours), the privacy officer (BAAs), and four confirmations: knee replacement volume and setting, the navigation and robotic systems and facilities Dr. Hartigan uses, his clinic days by site and his surgery sites, and whether the practice offers second opinions.</w:t>
+        <w:t>To start, we need Google Ads admin access (or we create the account in the practice's name), the website vendor contact for davidhartiganmd.com, the TCO marketing contact if group approval is needed for the campaign, the pages, or the TCO name, the intake lead, the privacy officer, and four confirmations: knee replacement volume and setting, the navigation and robotic systems and facilities used, clinic days by site and surgery sites, and whether second opinions are offered.</w:t>
       </w:r>
     </w:p>
     <w:p>
@@ -6846,7 +6846,7 @@
     <w:qFormat/>
     <w:rsid w:val="00FC693F"/>
     <w:pPr>
-      <w:spacing w:after="60" w:before="0" w:line="240" w:lineRule="auto"/>
+      <w:spacing w:after="40" w:before="0" w:line="240" w:lineRule="auto"/>
     </w:pPr>
     <w:rPr>
       <w:rFonts w:ascii="Arial" w:hAnsi="Arial" w:eastAsia="Arial" w:cs="Arial"/>
@@ -6908,7 +6908,7 @@
     <w:pPr>
       <w:keepNext/>
       <w:keepLines/>
-      <w:spacing w:before="120" w:after="60"/>
+      <w:spacing w:before="100" w:after="60"/>
       <w:outlineLvl w:val="0"/>
     </w:pPr>
     <w:rPr>
@@ -6932,7 +6932,7 @@
     <w:pPr>
       <w:keepNext/>
       <w:keepLines/>
-      <w:spacing w:before="120" w:after="60"/>
+      <w:spacing w:before="100" w:after="60"/>
       <w:outlineLvl w:val="1"/>
     </w:pPr>
     <w:rPr>

</xml_diff>

<commit_message>
Close the red-team recheck items
Single Company element in the docx metadata, cost per lead attributed
by report, Mayo described by its metro and Rochester presence, Pilot
Plan confirmations aligned with the proposal, unrounded arithmetic in
the strategy file, shorter note to Kristina, decisions log updated.

Co-Authored-By: Claude Fable 5.1 <noreply@anthropic.com>
Claude-Session: https://claude.ai/code/session_01GD6g2VXLwfea8fyRm3LH8N
</commit_message>
<xml_diff>
--- a/hartigan-ppc/06_proposal.docx
+++ b/hartigan-ppc/06_proposal.docx
@@ -835,7 +835,7 @@
         <w:t>The market.</w:t>
       </w:r>
       <w:r>
-        <w:t xml:space="preserve"> Allina Health Orthopedics (Plymouth and Edina), TRIA, Summit, M Health Fairview, and Mayo Clinic each offer hip or knee replacement nearby, Allina, TRIA, Summit, and Mayo also advertise hip arthroscopy or hip preservation, and TCO's own hip and knee pages name other surgeons, so the ads lead with what is verifiable and his: board certification, Mayo Clinic residency, and dual fellowship training.</w:t>
+        <w:t xml:space="preserve"> Allina Health Orthopedics (Plymouth and Edina), TRIA, Summit, and M Health Fairview each offer hip or knee replacement in the metro, Allina, TRIA, Summit, and Mayo Clinic (Minneapolis and Rochester) advertise hip arthroscopy or hip preservation, and TCO's own hip and knee pages name other surgeons, so the ads lead with what is verifiable and his: board certification, Mayo Clinic residency, and dual fellowship training.</w:t>
       </w:r>
     </w:p>
     <w:p>
@@ -2041,7 +2041,7 @@
               <w:pStyle w:val="TableText"/>
             </w:pPr>
             <w:r>
-              <w:t>Deployed spend divided by contacts; the national physicians and surgeons cost per lead is $40 to $66 (WordStream 2026, LocalIQ 2025), and ours runs higher because surgical clicks cost more and only 60-second calls and forms count</w:t>
+              <w:t>Deployed spend divided by contacts; the national cost per lead is $40 to $57 for physicians and surgeons (WordStream 2026 and 2025) and $66 for healthcare overall (LocalIQ 2025), and ours runs higher because surgical clicks cost more and only 60-second calls and forms count</w:t>
             </w:r>
           </w:p>
         </w:tc>
@@ -6280,7 +6280,7 @@
         <w:pStyle w:val="ListBullet"/>
       </w:pPr>
       <w:r>
-        <w:t>B1. WordStream by LocalIQ, 2026 Google Ads benchmarks: physicians and surgeons category, average CPC $4.76, click-through rate 6.61%, conversion rate 12.43%; national, multi-account, not orthopedics-specific; 2026. https://www.wordstream.com/blog/2026-google-ads-benchmarks</w:t>
+        <w:t>B1. WordStream by LocalIQ, 2026 Google Ads benchmarks: physicians and surgeons category, average CPC $4.76, click-through rate 6.61%, conversion rate 12.43%, cost per lead $40.04; national, multi-account, not orthopedics-specific; 2026. https://www.wordstream.com/blog/2026-google-ads-benchmarks</w:t>
       </w:r>
     </w:p>
     <w:p>
@@ -6288,7 +6288,7 @@
         <w:pStyle w:val="ListBullet"/>
       </w:pPr>
       <w:r>
-        <w:t>B2. WordStream by LocalIQ, 2025 Google Ads benchmarks: physicians and surgeons conversion rate 11.62%, CPC about $5.00; national; 2025.</w:t>
+        <w:t>B2. WordStream by LocalIQ, 2025 Google Ads benchmarks: physicians and surgeons conversion rate 11.62%, cost per lead $56.83, CPC about $5.00; national; 2025.</w:t>
       </w:r>
     </w:p>
     <w:p>

</xml_diff>